<commit_message>
Update response tracker for Editor p.2 minor items
Entry for line 26 (Editor's p.2 comment) updated to reflect the two
narrow fixes applied in commit 589f185:
- 'Recent theory papers' -> 'Existing theoretical work' (line 197)
- Mid-sentence Horton (2010) citation removed from line 201

The broader 'connections to cited papers are unclear' concern remains
open under Issue #3 pending PK's positioning paragraphs.

Co-Authored-By: Claude Opus 4.7 (1M context) <noreply@anthropic.com>
</commit_message>
<xml_diff>
--- a/referee_reports/Hot Towel - AEJ Micro Revision - Response Tracker.docx
+++ b/referee_reports/Hot Towel - AEJ Micro Revision - Response Tracker.docx
@@ -755,7 +755,7 @@
                 <w:color w:val="B57E00"/>
                 <w:sz w:val="20"/>
               </w:rPr>
-              <w:t>Response: PARTIALLY ADDRESSED</w:t>
+              <w:t>Response: PARTIALLY ADDRESSED — one open item</w:t>
             </w:r>
           </w:p>
           <w:p>
@@ -770,7 +770,7 @@
               <w:rPr>
                 <w:sz w:val="20"/>
               </w:rPr>
-              <w:t>p.3 'persists from partial to full market roll-out' rewritten for clarity. Citation style cleanup + mid-sentence Horton (2010) reposition + removing 'recent' from 2007-paper references: OPEN pending PK's positioning paragraphs (Issue #3 framing).</w:t>
+              <w:t>'Recent theory papers' (p.2) softened to 'Existing theoretical work' (line 197); mid-sentence Horton (2010) reference removed from intro (line 201) — the paper is still cited properly at line 683 in §IV.A where the platform is described. OPEN: the broader 'connections to cited papers are often unclear' concern — the systemic fix requires PK's positioning paragraphs (Issue #3 framing), after which the intro and §II Literature can be rewritten to explicitly state each citation's relationship to our contribution.</w:t>
             </w:r>
           </w:p>
           <w:p>
@@ -785,7 +785,7 @@
               <w:rPr>
                 <w:sz w:val="20"/>
               </w:rPr>
-              <w:t>p.3 rewrite applied; p.2 citation cleanup pending</w:t>
+              <w:t>hot_towel.tex lines 197 and 201 (applied); intro + §II systemic cleanup pending</w:t>
             </w:r>
           </w:p>
           <w:p>
@@ -800,7 +800,7 @@
               <w:rPr>
                 <w:sz w:val="20"/>
               </w:rPr>
-              <w:t>5da3999 (p.3 rewrite)</w:t>
+              <w:t>589f185 (two narrow fixes); Issue #3 for broader cleanup</w:t>
             </w:r>
           </w:p>
         </w:tc>

</xml_diff>